<commit_message>
remove job-seeking and canada-specific lines from resume
- Removed 'Actively Seeking International Opportunities' tagline
- Removed 'Work Authorisation: EU/Canada' line
- Removed GDPR consent line referencing Canada
- Resume is now location-neutral and universal
- Regenerated PDF
</commit_message>
<xml_diff>
--- a/resume.docx
+++ b/resume.docx
@@ -295,21 +295,6 @@
           <w:sz w:val="20"/>
         </w:rPr>
       </w:pPr>
-    </w:p>
-    <w:p>
-      <w:r>
-        <w:rPr>
-          <w:b/>
-          <w:sz w:val="20"/>
-        </w:rPr>
-        <w:t>🌍 Actively Seeking International Opportunities</w:t>
-      </w:r>
-      <w:r>
-        <w:rPr>
-          <w:sz w:val="20"/>
-        </w:rPr>
-        <w:t xml:space="preserve"> — Ready to relocate to the EU (Latvia, Estonia, Germany, Netherlands) or Canada. EU Blue Card and Canada Express Entry eligible. Available within notice period.</w:t>
-      </w:r>
     </w:p>
     <w:p>
       <w:pPr>
@@ -2485,13 +2470,13 @@
           <w:b/>
           <w:sz w:val="20"/>
         </w:rPr>
-        <w:t>Work Authorisation:</w:t>
-      </w:r>
-      <w:r>
-        <w:rPr>
-          <w:sz w:val="20"/>
-        </w:rPr>
-        <w:t xml:space="preserve"> EU Blue Card eligible (Latvia, Germany, Netherlands, Estonia). Canada Express Entry eligible. Open to employer-sponsored visa.</w:t>
+        <w:t>Availability:</w:t>
+      </w:r>
+      <w:r>
+        <w:rPr>
+          <w:sz w:val="20"/>
+        </w:rPr>
+        <w:t xml:space="preserve"> Available within notice period. Open to remote, hybrid, or on-site roles.</w:t>
       </w:r>
     </w:p>
     <w:p>
@@ -2503,24 +2488,6 @@
           <w:b/>
           <w:sz w:val="20"/>
         </w:rPr>
-        <w:t>Availability:</w:t>
-      </w:r>
-      <w:r>
-        <w:rPr>
-          <w:sz w:val="20"/>
-        </w:rPr>
-        <w:t xml:space="preserve"> Available within notice period. Open to remote, hybrid, or on-site roles.</w:t>
-      </w:r>
-    </w:p>
-    <w:p>
-      <w:pPr>
-        <w:pStyle w:val="ListBullet"/>
-      </w:pPr>
-      <w:r>
-        <w:rPr>
-          <w:b/>
-          <w:sz w:val="20"/>
-        </w:rPr>
         <w:t>International Experience:</w:t>
       </w:r>
       <w:r>
@@ -2528,18 +2495,6 @@
           <w:sz w:val="20"/>
         </w:rPr>
         <w:t xml:space="preserve"> Proven track record with distributed teams across Singapore, USA, and India in multicultural, cross-timezone environments.</w:t>
-      </w:r>
-    </w:p>
-    <w:p>
-      <w:pPr>
-        <w:jc w:val="center"/>
-      </w:pPr>
-      <w:r>
-        <w:rPr>
-          <w:color w:val="888888"/>
-          <w:sz w:val="16"/>
-        </w:rPr>
-        <w:t>I hereby consent to the processing of my personal data for the purposes of recruitment, in accordance with Regulation (EU) 2016/679 (GDPR) and the Personal Information Protection and Electronic Documents Act (PIPEDA) of Canada.</w:t>
       </w:r>
     </w:p>
     <w:sectPr>

</xml_diff>

<commit_message>
update resume with recent achievements (Aug 2026)
Added to Olea Global section:
- Cert renewal Azure AD automation (22 apps, Lambda + Graph API)
- Automated data patch execution pipeline (Jira -> GitHub -> RDS)
- Langfuse AI observability platform deployment (EKS)
- Pod restart alerting with auto Jira ticket creation
- CloudWatch log archive automation (Lambda + Step Functions + S3)
- Validated ,500/month ( annualized) cloud savings

Updated:
- Savings figure from 87K EUR to 90K+ USD (validated actual)
- Portfolio site stats and experience section to match
- PDF regenerated
</commit_message>
<xml_diff>
--- a/resume.docx
+++ b/resume.docx
@@ -341,7 +341,7 @@
           <w:b/>
           <w:sz w:val="20"/>
         </w:rPr>
-        <w:t>€87K+ in annualized cloud savings</w:t>
+        <w:t>\+ in annualized cloud savings</w:t>
       </w:r>
       <w:r>
         <w:rPr>
@@ -934,7 +934,7 @@
           <w:b/>
           <w:sz w:val="20"/>
         </w:rPr>
-        <w:t>€87,000+ annualized cloud savings</w:t>
+        <w:t>\,000+ annualized cloud savings</w:t>
       </w:r>
       <w:r>
         <w:rPr>
@@ -1086,7 +1086,7 @@
         <w:rPr>
           <w:sz w:val="20"/>
         </w:rPr>
-        <w:t xml:space="preserve"> — Architected comprehensive cost intelligence dashboard using QuickSight, CUR 2.0, and Athena with automated cross-account reporting, delivering €87K+ annual savings across 15 AWS accounts.</w:t>
+        <w:t xml:space="preserve"> — Architected comprehensive cost intelligence dashboard using QuickSight, CUR 2.0, and Athena with automated cross-account reporting, delivering \+ annual savings across 15 AWS accounts.</w:t>
       </w:r>
     </w:p>
     <w:p>
@@ -1191,7 +1191,7 @@
           <w:b/>
           <w:sz w:val="20"/>
         </w:rPr>
-        <w:t>€87K+ annualized cost savings</w:t>
+        <w:t>\+ annualized cost savings</w:t>
       </w:r>
       <w:r>
         <w:rPr>
@@ -1306,6 +1306,78 @@
           <w:sz w:val="20"/>
         </w:rPr>
         <w:t>.</w:t>
+      </w:r>
+    </w:p>
+    <w:p>
+      <w:pPr>
+        <w:pStyle w:val="ListBullet"/>
+      </w:pPr>
+      <w:r>
+        <w:rPr>
+          <w:b/>
+          <w:sz w:val="20"/>
+        </w:rPr>
+        <w:t xml:space="preserve">Designed and deployed automated certificate renewal system using AWS Lambda and Microsoft Graph API, automatically uploading SSL certificates to 22 Azure AD Enterprise Applications across UAT, PreProd, and Production environments — eliminating manual renewal processes.</w:t>
+      </w:r>
+    </w:p>
+    <w:p>
+      <w:pPr>
+        <w:pStyle w:val="ListBullet"/>
+      </w:pPr>
+      <w:r>
+        <w:rPr>
+          <w:b/>
+          <w:sz w:val="20"/>
+        </w:rPr>
+        <w:t xml:space="preserve">Built end-to-end automated data patch execution pipeline (Jira approval → GitHub Actions → self-hosted EC2 runner → RDS MySQL), achieving zero-touch database patching with full audit trail, transaction safety, and Teams notifications.</w:t>
+      </w:r>
+    </w:p>
+    <w:p>
+      <w:pPr>
+        <w:pStyle w:val="ListBullet"/>
+      </w:pPr>
+      <w:r>
+        <w:rPr>
+          <w:b/>
+          <w:sz w:val="20"/>
+        </w:rPr>
+        <w:t xml:space="preserve">Deployed Langfuse AI observability platform on EKS for LLM tracing and monitoring, enabling the organization’s first AI/ML tooling with internet-facing HTTPS access and Entra ID-compatible authentication.</w:t>
+      </w:r>
+    </w:p>
+    <w:p>
+      <w:pPr>
+        <w:pStyle w:val="ListBullet"/>
+      </w:pPr>
+      <w:r>
+        <w:rPr>
+          <w:b/>
+          <w:sz w:val="20"/>
+        </w:rPr>
+        <w:t xml:space="preserve">Implemented production pod restart alerting with automated Jira ticket creation using Prometheus, Alertmanager, and a custom webhook service — reducing incident response time and ensuring every restart is tracked and investigated.</w:t>
+      </w:r>
+    </w:p>
+    <w:p>
+      <w:pPr>
+        <w:pStyle w:val="ListBullet"/>
+      </w:pPr>
+      <w:r>
+        <w:rPr>
+          <w:b/>
+          <w:sz w:val="20"/>
+        </w:rPr>
+        <w:t xml:space="preserve">Architected CloudWatch log archive automation using Lambda, Step Functions, and S3 lifecycle policies (Standard → Glacier 90d → Delete 365d), reducing PreProd log storage by 528 GB while maintaining compliance retention.</w:t>
+      </w:r>
+    </w:p>
+    <w:p>
+      <w:pPr>
+        <w:pStyle w:val="ListBullet"/>
+      </w:pPr>
+      <w:r>
+        <w:rPr>
+          <w:b/>
+          <w:sz w:val="20"/>
+        </w:rPr>
+        <w:t xml:space="preserve">Validated \,500/month in confirmed cloud savings (\ annualized) across production, pre-production, and development accounts through S3 lifecycle policies, Aurora IO-Optimized migration, OpenSearch Graviton migration, and orphaned resource cleanup.</w:t>
       </w:r>
     </w:p>
     <w:p>

</xml_diff>

<commit_message>
fix: restore dollar signs in savings figures
Fixed ,000+ and ,500/month figures that were broken by
escape sequence issue during previous edit. All currency values
now display correctly in both docx and PDF.
</commit_message>
<xml_diff>
--- a/resume.docx
+++ b/resume.docx
@@ -341,7 +341,7 @@
           <w:b/>
           <w:sz w:val="20"/>
         </w:rPr>
-        <w:t>\+ in annualized cloud savings</w:t>
+        <w:t>$90,000+ in annualized cloud savings</w:t>
       </w:r>
       <w:r>
         <w:rPr>
@@ -934,7 +934,7 @@
           <w:b/>
           <w:sz w:val="20"/>
         </w:rPr>
-        <w:t>\,000+ annualized cloud savings</w:t>
+        <w:t>$90,000+ annualized cloud savings</w:t>
       </w:r>
       <w:r>
         <w:rPr>
@@ -1086,7 +1086,7 @@
         <w:rPr>
           <w:sz w:val="20"/>
         </w:rPr>
-        <w:t xml:space="preserve"> — Architected comprehensive cost intelligence dashboard using QuickSight, CUR 2.0, and Athena with automated cross-account reporting, delivering \+ annual savings across 15 AWS accounts.</w:t>
+        <w:t xml:space="preserve"> — Architected comprehensive cost intelligence dashboard using QuickSight, CUR 2.0, and Athena with automated cross-account reporting, delivering $90,000+ annual savings across 15 AWS accounts.</w:t>
       </w:r>
     </w:p>
     <w:p>
@@ -1191,7 +1191,7 @@
           <w:b/>
           <w:sz w:val="20"/>
         </w:rPr>
-        <w:t>\+ annualized cost savings</w:t>
+        <w:t>$90,000+ annualized cost savings</w:t>
       </w:r>
       <w:r>
         <w:rPr>
@@ -1377,7 +1377,7 @@
           <w:b/>
           <w:sz w:val="20"/>
         </w:rPr>
-        <w:t xml:space="preserve">Validated \,500/month in confirmed cloud savings (\ annualized) across production, pre-production, and development accounts through S3 lifecycle policies, Aurora IO-Optimized migration, OpenSearch Graviton migration, and orphaned resource cleanup.</w:t>
+        <w:t>Validated $7,500/month in confirmed cloud savings ($90,000+ annualized) across production, pre-production, and development accounts through S3 lifecycle policies, Aurora IO-Optimized migration, OpenSearch Graviton migration, and orphaned resource cleanup.</w:t>
       </w:r>
     </w:p>
     <w:p>

</xml_diff>